<commit_message>
docs(use-cases): align club actors and refresh diagrams
</commit_message>
<xml_diff>
--- a/docs/UCMS_UseCase_ByActor.docx
+++ b/docs/UCMS_UseCase_ByActor.docx
@@ -13,7 +13,7 @@
           <w:color w:val="17365D"/>
           <w:sz w:val="26"/>
         </w:rPr>
-        <w:t>01. All users</w:t>
+        <w:t xml:space="preserve">01. All users</w:t>
       </w:r>
     </w:p>
     <w:p>
@@ -25,7 +25,7 @@
         <w:rPr>
           <w:sz w:val="18"/>
         </w:rPr>
-        <w:t>Chức năng chung và quan hệ kế thừa giữa các actor.</w:t>
+        <w:t xml:space="preserve">Chức năng chung và quan hệ kế thừa giữa các actor.</w:t>
       </w:r>
     </w:p>
     <w:p>
@@ -36,7 +36,7 @@
       <w:r>
         <w:drawing>
           <wp:inline xmlns:a="http://schemas.openxmlformats.org/drawingml/2006/main" xmlns:pic="http://schemas.openxmlformats.org/drawingml/2006/picture">
-            <wp:extent cx="9684000" cy="3809166"/>
+            <wp:extent cx="9684000" cy="4056933"/>
             <wp:docPr id="1" name="Picture 1" descr="Sơ đồ 01: All users. Nguồn: UCMS_UseCase_ByActor_01_All-users.png" title="All users"/>
             <wp:cNvGraphicFramePr>
               <a:graphicFrameLocks noChangeAspect="1"/>
@@ -57,7 +57,7 @@
                   <pic:spPr>
                     <a:xfrm>
                       <a:off x="0" y="0"/>
-                      <a:ext cx="9684000" cy="3809166"/>
+                      <a:ext cx="9684000" cy="4056933"/>
                     </a:xfrm>
                     <a:prstGeom prst="rect"/>
                   </pic:spPr>
@@ -91,7 +91,7 @@
           <w:color w:val="17365D"/>
           <w:sz w:val="26"/>
         </w:rPr>
-        <w:t>02. Student</w:t>
+        <w:t xml:space="preserve">02. Student</w:t>
       </w:r>
     </w:p>
     <w:p>
@@ -103,7 +103,7 @@
         <w:rPr>
           <w:sz w:val="18"/>
         </w:rPr>
-        <w:t>Các chức năng dành cho sinh viên.</w:t>
+        <w:t xml:space="preserve">Các chức năng dành cho sinh viên.</w:t>
       </w:r>
     </w:p>
     <w:p>
@@ -114,7 +114,7 @@
       <w:r>
         <w:drawing>
           <wp:inline xmlns:a="http://schemas.openxmlformats.org/drawingml/2006/main" xmlns:pic="http://schemas.openxmlformats.org/drawingml/2006/picture">
-            <wp:extent cx="9425127" cy="5760000"/>
+            <wp:extent cx="9425127" cy="5801445"/>
             <wp:docPr id="2" name="Picture 2" descr="Sơ đồ 02: Student. Nguồn: UCMS_UseCase_ByActor_02_Student.png" title="Student"/>
             <wp:cNvGraphicFramePr>
               <a:graphicFrameLocks noChangeAspect="1"/>
@@ -135,7 +135,7 @@
                   <pic:spPr>
                     <a:xfrm>
                       <a:off x="0" y="0"/>
-                      <a:ext cx="9425127" cy="5760000"/>
+                      <a:ext cx="9425127" cy="5801445"/>
                     </a:xfrm>
                     <a:prstGeom prst="rect"/>
                   </pic:spPr>
@@ -167,7 +167,7 @@
           <w:color w:val="17365D"/>
           <w:sz w:val="26"/>
         </w:rPr>
-        <w:t>03. Club Leader</w:t>
+        <w:t xml:space="preserve">03. Club Member — Thành viên, điểm danh và phòng được cấp</w:t>
       </w:r>
     </w:p>
     <w:p>
@@ -179,7 +179,7 @@
         <w:rPr>
           <w:sz w:val="18"/>
         </w:rPr>
-        <w:t>Các chức năng riêng của chủ nhiệm CLB.</w:t>
+        <w:t xml:space="preserve">Chức năng mọi thành viên Active đều dùng, không cần cấp quyền: thành viên của tôi, điểm danh, xem phòng được cấp.</w:t>
       </w:r>
     </w:p>
     <w:p>
@@ -190,8 +190,8 @@
       <w:r>
         <w:drawing>
           <wp:inline xmlns:a="http://schemas.openxmlformats.org/drawingml/2006/main" xmlns:pic="http://schemas.openxmlformats.org/drawingml/2006/picture">
-            <wp:extent cx="6552000" cy="7642296"/>
-            <wp:docPr id="3" name="Picture 3" descr="Sơ đồ 03: Club Leader. Nguồn: UCMS_UseCase_ByActor_03_Club-Leader.png" title="Club Leader"/>
+            <wp:extent cx="6552000" cy="4557767"/>
+            <wp:docPr id="3" name="Picture 3" descr="Sơ đồ 03: Club Member — Thành viên, điểm danh và phòng được cấp. Nguồn: UCMS_UseCase_ByActor_03_Club-Member-Events-bookings.png" title="Club Leader"/>
             <wp:cNvGraphicFramePr>
               <a:graphicFrameLocks noChangeAspect="1"/>
             </wp:cNvGraphicFramePr>
@@ -199,7 +199,7 @@
               <a:graphicData uri="http://schemas.openxmlformats.org/drawingml/2006/picture">
                 <pic:pic>
                   <pic:nvPicPr>
-                    <pic:cNvPr id="0" name="UCMS_UseCase_ByActor_03_Club-Leader.png"/>
+                    <pic:cNvPr id="0" name="UCMS_UseCase_ByActor_03_Club-Member-Events-bookings.png"/>
                     <pic:cNvPicPr/>
                   </pic:nvPicPr>
                   <pic:blipFill>
@@ -211,7 +211,7 @@
                   <pic:spPr>
                     <a:xfrm>
                       <a:off x="0" y="0"/>
-                      <a:ext cx="6552000" cy="7642296"/>
+                      <a:ext cx="6552000" cy="4557767"/>
                     </a:xfrm>
                     <a:prstGeom prst="rect"/>
                   </pic:spPr>
@@ -243,7 +243,7 @@
           <w:color w:val="17365D"/>
           <w:sz w:val="26"/>
         </w:rPr>
-        <w:t>04. Club Member — CLB và tuyển thành viên</w:t>
+        <w:t xml:space="preserve">04. Club Leader</w:t>
       </w:r>
     </w:p>
     <w:p>
@@ -255,7 +255,7 @@
         <w:rPr>
           <w:sz w:val="18"/>
         </w:rPr>
-        <w:t>Hồ sơ CLB, tuyển thành viên và quản lý thành viên.</w:t>
+        <w:t xml:space="preserve">Quản lý vai trò CLB (chỉ là chức danh, không mang quyền), ban điều hành và đề nghị tạm ngừng.</w:t>
       </w:r>
     </w:p>
     <w:p>
@@ -266,8 +266,8 @@
       <w:r>
         <w:drawing>
           <wp:inline xmlns:a="http://schemas.openxmlformats.org/drawingml/2006/main" xmlns:pic="http://schemas.openxmlformats.org/drawingml/2006/picture">
-            <wp:extent cx="5983574" cy="8784000"/>
-            <wp:docPr id="4" name="Picture 4" descr="Sơ đồ 04: Club Member — CLB và tuyển thành viên. Nguồn: UCMS_UseCase_ByActor_04_Club-Member-1-Club-recruitment.png" title="Club Member — CLB và tuyển thành viên"/>
+            <wp:extent cx="5983574" cy="6963986"/>
+            <wp:docPr id="4" name="Picture 4" descr="Sơ đồ 04: Club Leader. Nguồn: UCMS_UseCase_ByActor_04_Club-Leader.png" title="Club Member — CLB và tuyển thành viên"/>
             <wp:cNvGraphicFramePr>
               <a:graphicFrameLocks noChangeAspect="1"/>
             </wp:cNvGraphicFramePr>
@@ -275,7 +275,7 @@
               <a:graphicData uri="http://schemas.openxmlformats.org/drawingml/2006/picture">
                 <pic:pic>
                   <pic:nvPicPr>
-                    <pic:cNvPr id="0" name="UCMS_UseCase_ByActor_04_Club-Member-1-Club-recruitment.png"/>
+                    <pic:cNvPr id="0" name="UCMS_UseCase_ByActor_04_Club-Leader.png"/>
                     <pic:cNvPicPr/>
                   </pic:nvPicPr>
                   <pic:blipFill>
@@ -287,7 +287,7 @@
                   <pic:spPr>
                     <a:xfrm>
                       <a:off x="0" y="0"/>
-                      <a:ext cx="5983574" cy="8784000"/>
+                      <a:ext cx="5983574" cy="6963986"/>
                     </a:xfrm>
                     <a:prstGeom prst="rect"/>
                   </pic:spPr>
@@ -319,7 +319,7 @@
           <w:color w:val="17365D"/>
           <w:sz w:val="26"/>
         </w:rPr>
-        <w:t>05. Club Member — Sự kiện và cơ sở vật chất</w:t>
+        <w:t xml:space="preserve">05. Club Leader — CLB và tuyển thành viên</w:t>
       </w:r>
     </w:p>
     <w:p>
@@ -331,7 +331,7 @@
         <w:rPr>
           <w:sz w:val="18"/>
         </w:rPr>
-        <w:t>Sự kiện, phòng học được cấp và yêu cầu sử dụng cơ sở vật chất.</w:t>
+        <w:t xml:space="preserve">Hồ sơ CLB, tuyển thành viên và quản lý thành viên — chỉ Club Leader thực hiện.</w:t>
       </w:r>
     </w:p>
     <w:p>
@@ -342,8 +342,8 @@
       <w:r>
         <w:drawing>
           <wp:inline xmlns:a="http://schemas.openxmlformats.org/drawingml/2006/main" xmlns:pic="http://schemas.openxmlformats.org/drawingml/2006/picture">
-            <wp:extent cx="6552000" cy="7356093"/>
-            <wp:docPr id="5" name="Picture 5" descr="Sơ đồ 05: Club Member — Sự kiện và cơ sở vật chất. Nguồn: UCMS_UseCase_ByActor_05_Club-Member-2-Events-bookings.png" title="Club Member — Sự kiện và cơ sở vật chất"/>
+            <wp:extent cx="6552000" cy="8162323"/>
+            <wp:docPr id="5" name="Picture 5" descr="Sơ đồ 05: Club Leader — CLB và tuyển thành viên. Nguồn: UCMS_UseCase_ByActor_05_Club-Leader-Club-recruitment.png" title="Club Member — Sự kiện và cơ sở vật chất"/>
             <wp:cNvGraphicFramePr>
               <a:graphicFrameLocks noChangeAspect="1"/>
             </wp:cNvGraphicFramePr>
@@ -351,7 +351,7 @@
               <a:graphicData uri="http://schemas.openxmlformats.org/drawingml/2006/picture">
                 <pic:pic>
                   <pic:nvPicPr>
-                    <pic:cNvPr id="0" name="UCMS_UseCase_ByActor_05_Club-Member-2-Events-bookings.png"/>
+                    <pic:cNvPr id="0" name="UCMS_UseCase_ByActor_05_Club-Leader-Club-recruitment.png"/>
                     <pic:cNvPicPr/>
                   </pic:nvPicPr>
                   <pic:blipFill>
@@ -363,7 +363,7 @@
                   <pic:spPr>
                     <a:xfrm>
                       <a:off x="0" y="0"/>
-                      <a:ext cx="6552000" cy="7356093"/>
+                      <a:ext cx="6552000" cy="8162323"/>
                     </a:xfrm>
                     <a:prstGeom prst="rect"/>
                   </pic:spPr>
@@ -395,7 +395,7 @@
           <w:color w:val="17365D"/>
           <w:sz w:val="26"/>
         </w:rPr>
-        <w:t>06. Club Member — Giải trình và tài chính</w:t>
+        <w:t xml:space="preserve">06. Club Leader — Sự kiện, cơ sở vật chất và tài chính</w:t>
       </w:r>
     </w:p>
     <w:p>
@@ -407,7 +407,7 @@
         <w:rPr>
           <w:sz w:val="18"/>
         </w:rPr>
-        <w:t>Báo cáo, giải trình và tài chính của CLB.</w:t>
+        <w:t xml:space="preserve">Sự kiện, đặt cơ sở vật chất, báo cáo, chi tiêu, phản hồi sự kiện và khiếu nại — chỉ Club Leader thực hiện.</w:t>
       </w:r>
     </w:p>
     <w:p>
@@ -418,8 +418,8 @@
       <w:r>
         <w:drawing>
           <wp:inline xmlns:a="http://schemas.openxmlformats.org/drawingml/2006/main" xmlns:pic="http://schemas.openxmlformats.org/drawingml/2006/picture">
-            <wp:extent cx="6552000" cy="5488960"/>
-            <wp:docPr id="6" name="Picture 6" descr="Sơ đồ 06: Club Member — Giải trình và tài chính. Nguồn: UCMS_UseCase_ByActor_06_Club-Member-3-Accountability-finance.png" title="Club Member — Giải trình và tài chính"/>
+            <wp:extent cx="6552000" cy="8028129"/>
+            <wp:docPr id="6" name="Picture 6" descr="Sơ đồ 06: Club Leader — Sự kiện, cơ sở vật chất và tài chính. Nguồn: UCMS_UseCase_ByActor_06_Club-Leader-Events-bookings-finance.png" title="Club Member — Giải trình và tài chính"/>
             <wp:cNvGraphicFramePr>
               <a:graphicFrameLocks noChangeAspect="1"/>
             </wp:cNvGraphicFramePr>
@@ -427,7 +427,7 @@
               <a:graphicData uri="http://schemas.openxmlformats.org/drawingml/2006/picture">
                 <pic:pic>
                   <pic:nvPicPr>
-                    <pic:cNvPr id="0" name="UCMS_UseCase_ByActor_06_Club-Member-3-Accountability-finance.png"/>
+                    <pic:cNvPr id="0" name="UCMS_UseCase_ByActor_06_Club-Leader-Events-bookings-finance.png"/>
                     <pic:cNvPicPr/>
                   </pic:nvPicPr>
                   <pic:blipFill>
@@ -439,7 +439,7 @@
                   <pic:spPr>
                     <a:xfrm>
                       <a:off x="0" y="0"/>
-                      <a:ext cx="6552000" cy="5488960"/>
+                      <a:ext cx="6552000" cy="8028129"/>
                     </a:xfrm>
                     <a:prstGeom prst="rect"/>
                   </pic:spPr>
@@ -471,7 +471,7 @@
           <w:color w:val="17365D"/>
           <w:sz w:val="26"/>
         </w:rPr>
-        <w:t>07. ICPDP Officer — Truy cập và vòng đời CLB</w:t>
+        <w:t xml:space="preserve">07. ICPDP Officer — Truy cập và vòng đời CLB</w:t>
       </w:r>
     </w:p>
     <w:p>
@@ -483,7 +483,7 @@
         <w:rPr>
           <w:sz w:val="18"/>
         </w:rPr>
-        <w:t>Quản lý truy cập và vòng đời CLB.</w:t>
+        <w:t xml:space="preserve">Quản lý truy cập và vòng đời CLB.</w:t>
       </w:r>
     </w:p>
     <w:p>
@@ -494,7 +494,7 @@
       <w:r>
         <w:drawing>
           <wp:inline xmlns:a="http://schemas.openxmlformats.org/drawingml/2006/main" xmlns:pic="http://schemas.openxmlformats.org/drawingml/2006/picture">
-            <wp:extent cx="6552000" cy="7097148"/>
+            <wp:extent cx="6552000" cy="7088774"/>
             <wp:docPr id="7" name="Picture 7" descr="Sơ đồ 07: ICPDP Officer — Truy cập và vòng đời CLB. Nguồn: UCMS_UseCase_ByActor_07_ICPDP-1-Access-club-lifecycle.png" title="ICPDP Officer — Truy cập và vòng đời CLB"/>
             <wp:cNvGraphicFramePr>
               <a:graphicFrameLocks noChangeAspect="1"/>
@@ -515,7 +515,7 @@
                   <pic:spPr>
                     <a:xfrm>
                       <a:off x="0" y="0"/>
-                      <a:ext cx="6552000" cy="7097148"/>
+                      <a:ext cx="6552000" cy="7088774"/>
                     </a:xfrm>
                     <a:prstGeom prst="rect"/>
                   </pic:spPr>
@@ -547,7 +547,7 @@
           <w:color w:val="17365D"/>
           <w:sz w:val="26"/>
         </w:rPr>
-        <w:t>08. ICPDP Officer — Sự kiện, cơ sở vật chất và tài chính</w:t>
+        <w:t xml:space="preserve">08. ICPDP Officer — Sự kiện, cơ sở vật chất và tài chính</w:t>
       </w:r>
     </w:p>
     <w:p>
@@ -559,7 +559,7 @@
         <w:rPr>
           <w:sz w:val="18"/>
         </w:rPr>
-        <w:t>Sự kiện, phân phòng học, cơ sở vật chất và tài chính.</w:t>
+        <w:t xml:space="preserve">Sự kiện, phân phòng học, cơ sở vật chất và tài chính.</w:t>
       </w:r>
     </w:p>
     <w:p>
@@ -570,7 +570,7 @@
       <w:r>
         <w:drawing>
           <wp:inline xmlns:a="http://schemas.openxmlformats.org/drawingml/2006/main" xmlns:pic="http://schemas.openxmlformats.org/drawingml/2006/picture">
-            <wp:extent cx="6552000" cy="8460018"/>
+            <wp:extent cx="6552000" cy="8430710"/>
             <wp:docPr id="8" name="Picture 8" descr="Sơ đồ 08: ICPDP Officer — Sự kiện, cơ sở vật chất và tài chính. Nguồn: UCMS_UseCase_ByActor_08_ICPDP-2-Events-bookings-finance.png" title="ICPDP Officer — Sự kiện, cơ sở vật chất và tài chính"/>
             <wp:cNvGraphicFramePr>
               <a:graphicFrameLocks noChangeAspect="1"/>
@@ -591,7 +591,7 @@
                   <pic:spPr>
                     <a:xfrm>
                       <a:off x="0" y="0"/>
-                      <a:ext cx="6552000" cy="8460018"/>
+                      <a:ext cx="6552000" cy="8430710"/>
                     </a:xfrm>
                     <a:prstGeom prst="rect"/>
                   </pic:spPr>
@@ -623,7 +623,7 @@
           <w:color w:val="17365D"/>
           <w:sz w:val="26"/>
         </w:rPr>
-        <w:t>09. ICPDP Officer — Tuân thủ và đánh giá</w:t>
+        <w:t xml:space="preserve">09. ICPDP Officer — Tuân thủ và đánh giá</w:t>
       </w:r>
     </w:p>
     <w:p>
@@ -635,7 +635,7 @@
         <w:rPr>
           <w:sz w:val="18"/>
         </w:rPr>
-        <w:t>Giám sát tuân thủ và đánh giá CLB.</w:t>
+        <w:t xml:space="preserve">Giám sát tuân thủ và đánh giá CLB.</w:t>
       </w:r>
     </w:p>
     <w:p>
@@ -646,7 +646,7 @@
       <w:r>
         <w:drawing>
           <wp:inline xmlns:a="http://schemas.openxmlformats.org/drawingml/2006/main" xmlns:pic="http://schemas.openxmlformats.org/drawingml/2006/picture">
-            <wp:extent cx="6552000" cy="7914870"/>
+            <wp:extent cx="6552000" cy="7893935"/>
             <wp:docPr id="9" name="Picture 9" descr="Sơ đồ 09: ICPDP Officer — Tuân thủ và đánh giá. Nguồn: UCMS_UseCase_ByActor_09_ICPDP-3-Compliance-evaluation.png" title="ICPDP Officer — Tuân thủ và đánh giá"/>
             <wp:cNvGraphicFramePr>
               <a:graphicFrameLocks noChangeAspect="1"/>
@@ -667,7 +667,7 @@
                   <pic:spPr>
                     <a:xfrm>
                       <a:off x="0" y="0"/>
-                      <a:ext cx="6552000" cy="7914870"/>
+                      <a:ext cx="6552000" cy="7893935"/>
                     </a:xfrm>
                     <a:prstGeom prst="rect"/>
                   </pic:spPr>

</xml_diff>